<commit_message>
with how to use UPPAAL and FreeRTOS
raw sketch of paper incl. Bullet points and refined references. Evaluation and tooling should be defined (how to use UPPAAL and FreeRTOS).
</commit_message>
<xml_diff>
--- a/Paper outlines in bullet points.docx
+++ b/Paper outlines in bullet points.docx
@@ -811,6 +811,229 @@
           <w:bCs/>
         </w:rPr>
         <w:t>References</w:t>
+      </w:r>
+    </w:p>
+    <w:p>
+      <w:pPr>
+        <w:pStyle w:val="Heading3"/>
+      </w:pPr>
+      <w:r>
+        <w:rPr>
+          <w:rStyle w:val="Strong"/>
+          <w:b w:val="0"/>
+          <w:bCs w:val="0"/>
+        </w:rPr>
+        <w:t xml:space="preserve">Evaluation &amp; </w:t>
+      </w:r>
+      <w:proofErr w:type="spellStart"/>
+      <w:r>
+        <w:rPr>
+          <w:rStyle w:val="Strong"/>
+          <w:b w:val="0"/>
+          <w:bCs w:val="0"/>
+        </w:rPr>
+        <w:t>Tooling</w:t>
+      </w:r>
+      <w:proofErr w:type="spellEnd"/>
+    </w:p>
+    <w:p>
+      <w:pPr>
+        <w:pStyle w:val="Heading4"/>
+      </w:pPr>
+      <w:proofErr w:type="spellStart"/>
+      <w:r>
+        <w:rPr>
+          <w:rStyle w:val="Strong"/>
+          <w:b/>
+          <w:bCs/>
+        </w:rPr>
+        <w:t>Using</w:t>
+      </w:r>
+      <w:proofErr w:type="spellEnd"/>
+      <w:r>
+        <w:rPr>
+          <w:rStyle w:val="Strong"/>
+          <w:b/>
+          <w:bCs/>
+        </w:rPr>
+        <w:t xml:space="preserve"> UPPAAL:</w:t>
+      </w:r>
+    </w:p>
+    <w:p>
+      <w:pPr>
+        <w:pStyle w:val="NormalWeb"/>
+        <w:numPr>
+          <w:ilvl w:val="0"/>
+          <w:numId w:val="11"/>
+        </w:numPr>
+        <w:rPr>
+          <w:lang w:val="en-US"/>
+        </w:rPr>
+      </w:pPr>
+      <w:r>
+        <w:rPr>
+          <w:lang w:val="en-US"/>
+        </w:rPr>
+        <w:t>Define timed automata models for resource access protocols</w:t>
+      </w:r>
+    </w:p>
+    <w:p>
+      <w:pPr>
+        <w:pStyle w:val="NormalWeb"/>
+        <w:numPr>
+          <w:ilvl w:val="0"/>
+          <w:numId w:val="11"/>
+        </w:numPr>
+        <w:rPr>
+          <w:lang w:val="en-US"/>
+        </w:rPr>
+      </w:pPr>
+      <w:r>
+        <w:rPr>
+          <w:lang w:val="en-US"/>
+        </w:rPr>
+        <w:t>Simulate task execution and analyze protocol efficiency</w:t>
+      </w:r>
+    </w:p>
+    <w:p>
+      <w:pPr>
+        <w:pStyle w:val="NormalWeb"/>
+        <w:numPr>
+          <w:ilvl w:val="0"/>
+          <w:numId w:val="11"/>
+        </w:numPr>
+      </w:pPr>
+      <w:proofErr w:type="spellStart"/>
+      <w:r>
+        <w:t>Validate</w:t>
+      </w:r>
+      <w:proofErr w:type="spellEnd"/>
+      <w:r>
+        <w:t xml:space="preserve"> real-time </w:t>
+      </w:r>
+      <w:proofErr w:type="spellStart"/>
+      <w:r>
+        <w:t>scheduling</w:t>
+      </w:r>
+      <w:proofErr w:type="spellEnd"/>
+      <w:r>
+        <w:t xml:space="preserve"> </w:t>
+      </w:r>
+      <w:proofErr w:type="spellStart"/>
+      <w:r>
+        <w:t>constraints</w:t>
+      </w:r>
+      <w:proofErr w:type="spellEnd"/>
+    </w:p>
+    <w:p>
+      <w:pPr>
+        <w:pStyle w:val="Heading4"/>
+      </w:pPr>
+      <w:proofErr w:type="spellStart"/>
+      <w:r>
+        <w:rPr>
+          <w:rStyle w:val="Strong"/>
+          <w:b/>
+          <w:bCs/>
+        </w:rPr>
+        <w:lastRenderedPageBreak/>
+        <w:t>Using</w:t>
+      </w:r>
+      <w:proofErr w:type="spellEnd"/>
+      <w:r>
+        <w:rPr>
+          <w:rStyle w:val="Strong"/>
+          <w:b/>
+          <w:bCs/>
+        </w:rPr>
+        <w:t xml:space="preserve"> </w:t>
+      </w:r>
+      <w:proofErr w:type="spellStart"/>
+      <w:r>
+        <w:rPr>
+          <w:rStyle w:val="Strong"/>
+          <w:b/>
+          <w:bCs/>
+        </w:rPr>
+        <w:t>FreeRTOS</w:t>
+      </w:r>
+      <w:proofErr w:type="spellEnd"/>
+      <w:r>
+        <w:rPr>
+          <w:rStyle w:val="Strong"/>
+          <w:b/>
+          <w:bCs/>
+        </w:rPr>
+        <w:t>:</w:t>
+      </w:r>
+    </w:p>
+    <w:p>
+      <w:pPr>
+        <w:pStyle w:val="NormalWeb"/>
+        <w:numPr>
+          <w:ilvl w:val="0"/>
+          <w:numId w:val="12"/>
+        </w:numPr>
+      </w:pPr>
+      <w:r>
+        <w:t xml:space="preserve">Implement </w:t>
+      </w:r>
+      <w:proofErr w:type="spellStart"/>
+      <w:r>
+        <w:t>priority</w:t>
+      </w:r>
+      <w:proofErr w:type="spellEnd"/>
+      <w:r>
+        <w:t xml:space="preserve"> </w:t>
+      </w:r>
+      <w:proofErr w:type="spellStart"/>
+      <w:r>
+        <w:t>scheduling</w:t>
+      </w:r>
+      <w:proofErr w:type="spellEnd"/>
+      <w:r>
+        <w:t xml:space="preserve"> </w:t>
+      </w:r>
+      <w:proofErr w:type="spellStart"/>
+      <w:r>
+        <w:t>mechanisms</w:t>
+      </w:r>
+      <w:proofErr w:type="spellEnd"/>
+    </w:p>
+    <w:p>
+      <w:pPr>
+        <w:pStyle w:val="NormalWeb"/>
+        <w:numPr>
+          <w:ilvl w:val="0"/>
+          <w:numId w:val="12"/>
+        </w:numPr>
+        <w:rPr>
+          <w:lang w:val="en-US"/>
+        </w:rPr>
+      </w:pPr>
+      <w:r>
+        <w:rPr>
+          <w:lang w:val="en-US"/>
+        </w:rPr>
+        <w:t>Evaluate protocol performance under different workloads</w:t>
+      </w:r>
+    </w:p>
+    <w:p>
+      <w:pPr>
+        <w:pStyle w:val="NormalWeb"/>
+        <w:numPr>
+          <w:ilvl w:val="0"/>
+          <w:numId w:val="12"/>
+        </w:numPr>
+        <w:rPr>
+          <w:lang w:val="en-US"/>
+        </w:rPr>
+      </w:pPr>
+      <w:r>
+        <w:rPr>
+          <w:lang w:val="en-US"/>
+        </w:rPr>
+        <w:t>Measure task execution times and context switching overhead</w:t>
       </w:r>
     </w:p>
     <w:p>
@@ -1290,6 +1513,155 @@
     </w:lvl>
   </w:abstractNum>
   <w:abstractNum w:abstractNumId="3" w15:restartNumberingAfterBreak="0">
+    <w:nsid w:val="22DD41E7"/>
+    <w:multiLevelType w:val="multilevel"/>
+    <w:tmpl w:val="1B4C86D4"/>
+    <w:lvl w:ilvl="0">
+      <w:start w:val="1"/>
+      <w:numFmt w:val="bullet"/>
+      <w:lvlText w:val=""/>
+      <w:lvlJc w:val="left"/>
+      <w:pPr>
+        <w:tabs>
+          <w:tab w:val="num" w:pos="720"/>
+        </w:tabs>
+        <w:ind w:left="720" w:hanging="360"/>
+      </w:pPr>
+      <w:rPr>
+        <w:rFonts w:ascii="Symbol" w:hAnsi="Symbol" w:hint="default"/>
+        <w:sz w:val="20"/>
+      </w:rPr>
+    </w:lvl>
+    <w:lvl w:ilvl="1" w:tentative="1">
+      <w:start w:val="1"/>
+      <w:numFmt w:val="bullet"/>
+      <w:lvlText w:val="o"/>
+      <w:lvlJc w:val="left"/>
+      <w:pPr>
+        <w:tabs>
+          <w:tab w:val="num" w:pos="1440"/>
+        </w:tabs>
+        <w:ind w:left="1440" w:hanging="360"/>
+      </w:pPr>
+      <w:rPr>
+        <w:rFonts w:ascii="Courier New" w:hAnsi="Courier New" w:hint="default"/>
+        <w:sz w:val="20"/>
+      </w:rPr>
+    </w:lvl>
+    <w:lvl w:ilvl="2" w:tentative="1">
+      <w:start w:val="1"/>
+      <w:numFmt w:val="bullet"/>
+      <w:lvlText w:val=""/>
+      <w:lvlJc w:val="left"/>
+      <w:pPr>
+        <w:tabs>
+          <w:tab w:val="num" w:pos="2160"/>
+        </w:tabs>
+        <w:ind w:left="2160" w:hanging="360"/>
+      </w:pPr>
+      <w:rPr>
+        <w:rFonts w:ascii="Wingdings" w:hAnsi="Wingdings" w:hint="default"/>
+        <w:sz w:val="20"/>
+      </w:rPr>
+    </w:lvl>
+    <w:lvl w:ilvl="3" w:tentative="1">
+      <w:start w:val="1"/>
+      <w:numFmt w:val="bullet"/>
+      <w:lvlText w:val=""/>
+      <w:lvlJc w:val="left"/>
+      <w:pPr>
+        <w:tabs>
+          <w:tab w:val="num" w:pos="2880"/>
+        </w:tabs>
+        <w:ind w:left="2880" w:hanging="360"/>
+      </w:pPr>
+      <w:rPr>
+        <w:rFonts w:ascii="Wingdings" w:hAnsi="Wingdings" w:hint="default"/>
+        <w:sz w:val="20"/>
+      </w:rPr>
+    </w:lvl>
+    <w:lvl w:ilvl="4" w:tentative="1">
+      <w:start w:val="1"/>
+      <w:numFmt w:val="bullet"/>
+      <w:lvlText w:val=""/>
+      <w:lvlJc w:val="left"/>
+      <w:pPr>
+        <w:tabs>
+          <w:tab w:val="num" w:pos="3600"/>
+        </w:tabs>
+        <w:ind w:left="3600" w:hanging="360"/>
+      </w:pPr>
+      <w:rPr>
+        <w:rFonts w:ascii="Wingdings" w:hAnsi="Wingdings" w:hint="default"/>
+        <w:sz w:val="20"/>
+      </w:rPr>
+    </w:lvl>
+    <w:lvl w:ilvl="5" w:tentative="1">
+      <w:start w:val="1"/>
+      <w:numFmt w:val="bullet"/>
+      <w:lvlText w:val=""/>
+      <w:lvlJc w:val="left"/>
+      <w:pPr>
+        <w:tabs>
+          <w:tab w:val="num" w:pos="4320"/>
+        </w:tabs>
+        <w:ind w:left="4320" w:hanging="360"/>
+      </w:pPr>
+      <w:rPr>
+        <w:rFonts w:ascii="Wingdings" w:hAnsi="Wingdings" w:hint="default"/>
+        <w:sz w:val="20"/>
+      </w:rPr>
+    </w:lvl>
+    <w:lvl w:ilvl="6" w:tentative="1">
+      <w:start w:val="1"/>
+      <w:numFmt w:val="bullet"/>
+      <w:lvlText w:val=""/>
+      <w:lvlJc w:val="left"/>
+      <w:pPr>
+        <w:tabs>
+          <w:tab w:val="num" w:pos="5040"/>
+        </w:tabs>
+        <w:ind w:left="5040" w:hanging="360"/>
+      </w:pPr>
+      <w:rPr>
+        <w:rFonts w:ascii="Wingdings" w:hAnsi="Wingdings" w:hint="default"/>
+        <w:sz w:val="20"/>
+      </w:rPr>
+    </w:lvl>
+    <w:lvl w:ilvl="7" w:tentative="1">
+      <w:start w:val="1"/>
+      <w:numFmt w:val="bullet"/>
+      <w:lvlText w:val=""/>
+      <w:lvlJc w:val="left"/>
+      <w:pPr>
+        <w:tabs>
+          <w:tab w:val="num" w:pos="5760"/>
+        </w:tabs>
+        <w:ind w:left="5760" w:hanging="360"/>
+      </w:pPr>
+      <w:rPr>
+        <w:rFonts w:ascii="Wingdings" w:hAnsi="Wingdings" w:hint="default"/>
+        <w:sz w:val="20"/>
+      </w:rPr>
+    </w:lvl>
+    <w:lvl w:ilvl="8" w:tentative="1">
+      <w:start w:val="1"/>
+      <w:numFmt w:val="bullet"/>
+      <w:lvlText w:val=""/>
+      <w:lvlJc w:val="left"/>
+      <w:pPr>
+        <w:tabs>
+          <w:tab w:val="num" w:pos="6480"/>
+        </w:tabs>
+        <w:ind w:left="6480" w:hanging="360"/>
+      </w:pPr>
+      <w:rPr>
+        <w:rFonts w:ascii="Wingdings" w:hAnsi="Wingdings" w:hint="default"/>
+        <w:sz w:val="20"/>
+      </w:rPr>
+    </w:lvl>
+  </w:abstractNum>
+  <w:abstractNum w:abstractNumId="4" w15:restartNumberingAfterBreak="0">
     <w:nsid w:val="24D66143"/>
     <w:multiLevelType w:val="multilevel"/>
     <w:tmpl w:val="18EA2540"/>
@@ -1438,7 +1810,7 @@
       </w:rPr>
     </w:lvl>
   </w:abstractNum>
-  <w:abstractNum w:abstractNumId="4" w15:restartNumberingAfterBreak="0">
+  <w:abstractNum w:abstractNumId="5" w15:restartNumberingAfterBreak="0">
     <w:nsid w:val="2A4F4EB7"/>
     <w:multiLevelType w:val="multilevel"/>
     <w:tmpl w:val="FE36E4C6"/>
@@ -1587,7 +1959,7 @@
       </w:rPr>
     </w:lvl>
   </w:abstractNum>
-  <w:abstractNum w:abstractNumId="5" w15:restartNumberingAfterBreak="0">
+  <w:abstractNum w:abstractNumId="6" w15:restartNumberingAfterBreak="0">
     <w:nsid w:val="2DFE1CC3"/>
     <w:multiLevelType w:val="multilevel"/>
     <w:tmpl w:val="21646B44"/>
@@ -1736,7 +2108,7 @@
       </w:rPr>
     </w:lvl>
   </w:abstractNum>
-  <w:abstractNum w:abstractNumId="6" w15:restartNumberingAfterBreak="0">
+  <w:abstractNum w:abstractNumId="7" w15:restartNumberingAfterBreak="0">
     <w:nsid w:val="37527790"/>
     <w:multiLevelType w:val="multilevel"/>
     <w:tmpl w:val="241A5E2A"/>
@@ -1885,7 +2257,156 @@
       </w:rPr>
     </w:lvl>
   </w:abstractNum>
-  <w:abstractNum w:abstractNumId="7" w15:restartNumberingAfterBreak="0">
+  <w:abstractNum w:abstractNumId="8" w15:restartNumberingAfterBreak="0">
+    <w:nsid w:val="37964655"/>
+    <w:multiLevelType w:val="multilevel"/>
+    <w:tmpl w:val="E9A04BFA"/>
+    <w:lvl w:ilvl="0">
+      <w:start w:val="1"/>
+      <w:numFmt w:val="bullet"/>
+      <w:lvlText w:val=""/>
+      <w:lvlJc w:val="left"/>
+      <w:pPr>
+        <w:tabs>
+          <w:tab w:val="num" w:pos="720"/>
+        </w:tabs>
+        <w:ind w:left="720" w:hanging="360"/>
+      </w:pPr>
+      <w:rPr>
+        <w:rFonts w:ascii="Symbol" w:hAnsi="Symbol" w:hint="default"/>
+        <w:sz w:val="20"/>
+      </w:rPr>
+    </w:lvl>
+    <w:lvl w:ilvl="1" w:tentative="1">
+      <w:start w:val="1"/>
+      <w:numFmt w:val="bullet"/>
+      <w:lvlText w:val="o"/>
+      <w:lvlJc w:val="left"/>
+      <w:pPr>
+        <w:tabs>
+          <w:tab w:val="num" w:pos="1440"/>
+        </w:tabs>
+        <w:ind w:left="1440" w:hanging="360"/>
+      </w:pPr>
+      <w:rPr>
+        <w:rFonts w:ascii="Courier New" w:hAnsi="Courier New" w:hint="default"/>
+        <w:sz w:val="20"/>
+      </w:rPr>
+    </w:lvl>
+    <w:lvl w:ilvl="2" w:tentative="1">
+      <w:start w:val="1"/>
+      <w:numFmt w:val="bullet"/>
+      <w:lvlText w:val=""/>
+      <w:lvlJc w:val="left"/>
+      <w:pPr>
+        <w:tabs>
+          <w:tab w:val="num" w:pos="2160"/>
+        </w:tabs>
+        <w:ind w:left="2160" w:hanging="360"/>
+      </w:pPr>
+      <w:rPr>
+        <w:rFonts w:ascii="Wingdings" w:hAnsi="Wingdings" w:hint="default"/>
+        <w:sz w:val="20"/>
+      </w:rPr>
+    </w:lvl>
+    <w:lvl w:ilvl="3" w:tentative="1">
+      <w:start w:val="1"/>
+      <w:numFmt w:val="bullet"/>
+      <w:lvlText w:val=""/>
+      <w:lvlJc w:val="left"/>
+      <w:pPr>
+        <w:tabs>
+          <w:tab w:val="num" w:pos="2880"/>
+        </w:tabs>
+        <w:ind w:left="2880" w:hanging="360"/>
+      </w:pPr>
+      <w:rPr>
+        <w:rFonts w:ascii="Wingdings" w:hAnsi="Wingdings" w:hint="default"/>
+        <w:sz w:val="20"/>
+      </w:rPr>
+    </w:lvl>
+    <w:lvl w:ilvl="4" w:tentative="1">
+      <w:start w:val="1"/>
+      <w:numFmt w:val="bullet"/>
+      <w:lvlText w:val=""/>
+      <w:lvlJc w:val="left"/>
+      <w:pPr>
+        <w:tabs>
+          <w:tab w:val="num" w:pos="3600"/>
+        </w:tabs>
+        <w:ind w:left="3600" w:hanging="360"/>
+      </w:pPr>
+      <w:rPr>
+        <w:rFonts w:ascii="Wingdings" w:hAnsi="Wingdings" w:hint="default"/>
+        <w:sz w:val="20"/>
+      </w:rPr>
+    </w:lvl>
+    <w:lvl w:ilvl="5" w:tentative="1">
+      <w:start w:val="1"/>
+      <w:numFmt w:val="bullet"/>
+      <w:lvlText w:val=""/>
+      <w:lvlJc w:val="left"/>
+      <w:pPr>
+        <w:tabs>
+          <w:tab w:val="num" w:pos="4320"/>
+        </w:tabs>
+        <w:ind w:left="4320" w:hanging="360"/>
+      </w:pPr>
+      <w:rPr>
+        <w:rFonts w:ascii="Wingdings" w:hAnsi="Wingdings" w:hint="default"/>
+        <w:sz w:val="20"/>
+      </w:rPr>
+    </w:lvl>
+    <w:lvl w:ilvl="6" w:tentative="1">
+      <w:start w:val="1"/>
+      <w:numFmt w:val="bullet"/>
+      <w:lvlText w:val=""/>
+      <w:lvlJc w:val="left"/>
+      <w:pPr>
+        <w:tabs>
+          <w:tab w:val="num" w:pos="5040"/>
+        </w:tabs>
+        <w:ind w:left="5040" w:hanging="360"/>
+      </w:pPr>
+      <w:rPr>
+        <w:rFonts w:ascii="Wingdings" w:hAnsi="Wingdings" w:hint="default"/>
+        <w:sz w:val="20"/>
+      </w:rPr>
+    </w:lvl>
+    <w:lvl w:ilvl="7" w:tentative="1">
+      <w:start w:val="1"/>
+      <w:numFmt w:val="bullet"/>
+      <w:lvlText w:val=""/>
+      <w:lvlJc w:val="left"/>
+      <w:pPr>
+        <w:tabs>
+          <w:tab w:val="num" w:pos="5760"/>
+        </w:tabs>
+        <w:ind w:left="5760" w:hanging="360"/>
+      </w:pPr>
+      <w:rPr>
+        <w:rFonts w:ascii="Wingdings" w:hAnsi="Wingdings" w:hint="default"/>
+        <w:sz w:val="20"/>
+      </w:rPr>
+    </w:lvl>
+    <w:lvl w:ilvl="8" w:tentative="1">
+      <w:start w:val="1"/>
+      <w:numFmt w:val="bullet"/>
+      <w:lvlText w:val=""/>
+      <w:lvlJc w:val="left"/>
+      <w:pPr>
+        <w:tabs>
+          <w:tab w:val="num" w:pos="6480"/>
+        </w:tabs>
+        <w:ind w:left="6480" w:hanging="360"/>
+      </w:pPr>
+      <w:rPr>
+        <w:rFonts w:ascii="Wingdings" w:hAnsi="Wingdings" w:hint="default"/>
+        <w:sz w:val="20"/>
+      </w:rPr>
+    </w:lvl>
+  </w:abstractNum>
+  <w:abstractNum w:abstractNumId="9" w15:restartNumberingAfterBreak="0">
     <w:nsid w:val="40343C63"/>
     <w:multiLevelType w:val="multilevel"/>
     <w:tmpl w:val="DFB0E648"/>
@@ -2034,7 +2555,7 @@
       </w:rPr>
     </w:lvl>
   </w:abstractNum>
-  <w:abstractNum w:abstractNumId="8" w15:restartNumberingAfterBreak="0">
+  <w:abstractNum w:abstractNumId="10" w15:restartNumberingAfterBreak="0">
     <w:nsid w:val="4F0A07B9"/>
     <w:multiLevelType w:val="multilevel"/>
     <w:tmpl w:val="FB9AFE88"/>
@@ -2183,7 +2704,7 @@
       </w:rPr>
     </w:lvl>
   </w:abstractNum>
-  <w:abstractNum w:abstractNumId="9" w15:restartNumberingAfterBreak="0">
+  <w:abstractNum w:abstractNumId="11" w15:restartNumberingAfterBreak="0">
     <w:nsid w:val="71495DA4"/>
     <w:multiLevelType w:val="multilevel"/>
     <w:tmpl w:val="40E4D8BE"/>
@@ -2336,31 +2857,37 @@
     <w:abstractNumId w:val="1"/>
   </w:num>
   <w:num w:numId="2">
-    <w:abstractNumId w:val="3"/>
+    <w:abstractNumId w:val="4"/>
   </w:num>
   <w:num w:numId="3">
-    <w:abstractNumId w:val="5"/>
+    <w:abstractNumId w:val="6"/>
   </w:num>
   <w:num w:numId="4">
     <w:abstractNumId w:val="2"/>
   </w:num>
   <w:num w:numId="5">
-    <w:abstractNumId w:val="8"/>
+    <w:abstractNumId w:val="10"/>
   </w:num>
   <w:num w:numId="6">
-    <w:abstractNumId w:val="4"/>
+    <w:abstractNumId w:val="5"/>
   </w:num>
   <w:num w:numId="7">
     <w:abstractNumId w:val="0"/>
   </w:num>
   <w:num w:numId="8">
+    <w:abstractNumId w:val="9"/>
+  </w:num>
+  <w:num w:numId="9">
+    <w:abstractNumId w:val="11"/>
+  </w:num>
+  <w:num w:numId="10">
     <w:abstractNumId w:val="7"/>
   </w:num>
-  <w:num w:numId="9">
-    <w:abstractNumId w:val="9"/>
+  <w:num w:numId="11">
+    <w:abstractNumId w:val="8"/>
   </w:num>
-  <w:num w:numId="10">
-    <w:abstractNumId w:val="6"/>
+  <w:num w:numId="12">
+    <w:abstractNumId w:val="3"/>
   </w:num>
 </w:numbering>
 </file>
@@ -2763,6 +3290,29 @@
     <w:name w:val="Normal"/>
     <w:qFormat/>
   </w:style>
+  <w:style w:type="paragraph" w:styleId="Heading3">
+    <w:name w:val="heading 3"/>
+    <w:basedOn w:val="Normal"/>
+    <w:next w:val="Normal"/>
+    <w:link w:val="Heading3Char"/>
+    <w:uiPriority w:val="9"/>
+    <w:semiHidden/>
+    <w:unhideWhenUsed/>
+    <w:qFormat/>
+    <w:rsid w:val="00F01790"/>
+    <w:pPr>
+      <w:keepNext/>
+      <w:keepLines/>
+      <w:spacing w:before="40" w:after="0"/>
+      <w:outlineLvl w:val="2"/>
+    </w:pPr>
+    <w:rPr>
+      <w:rFonts w:asciiTheme="majorHAnsi" w:eastAsiaTheme="majorEastAsia" w:hAnsiTheme="majorHAnsi" w:cstheme="majorBidi"/>
+      <w:color w:val="1F3763" w:themeColor="accent1" w:themeShade="7F"/>
+      <w:sz w:val="24"/>
+      <w:szCs w:val="24"/>
+    </w:rPr>
+  </w:style>
   <w:style w:type="paragraph" w:styleId="Heading4">
     <w:name w:val="heading 4"/>
     <w:basedOn w:val="Normal"/>
@@ -2850,6 +3400,20 @@
       <w:sz w:val="24"/>
       <w:szCs w:val="24"/>
       <w:lang w:eastAsia="de-DE"/>
+    </w:rPr>
+  </w:style>
+  <w:style w:type="character" w:customStyle="1" w:styleId="Heading3Char">
+    <w:name w:val="Heading 3 Char"/>
+    <w:basedOn w:val="DefaultParagraphFont"/>
+    <w:link w:val="Heading3"/>
+    <w:uiPriority w:val="9"/>
+    <w:semiHidden/>
+    <w:rsid w:val="00F01790"/>
+    <w:rPr>
+      <w:rFonts w:asciiTheme="majorHAnsi" w:eastAsiaTheme="majorEastAsia" w:hAnsiTheme="majorHAnsi" w:cstheme="majorBidi"/>
+      <w:color w:val="1F3763" w:themeColor="accent1" w:themeShade="7F"/>
+      <w:sz w:val="24"/>
+      <w:szCs w:val="24"/>
     </w:rPr>
   </w:style>
 </w:styles>

</xml_diff>